<commit_message>
fix: all data verified against BLS May 2024, CLARB, LAAB, ASLA sources - BLS stats updated (,660 median, 3% growth, 21,800 jobs) - BlackLAN name/URL corrected (blacklanetwork.org) - CLARB IDP→CLARB Record fix - HBCU claim qualified (undergraduate BSLA) - program established 1976 added - fake LARE pass rate removed
</commit_message>
<xml_diff>
--- a/output/CAES-LA_Experiential_Major_Map.docx
+++ b/output/CAES-LA_Experiential_Major_Map.docx
@@ -4025,13 +4025,13 @@
                                 <w:b/>
                                 <w:color w:val="000000"/>
                               </w:rPr>
-                              <w:t xml:space="preserve">4% 2022-2032 </w:t>
-                            </w:r>
-                            <w:r>
-                              <w:rPr>
-                                <w:color w:val="000000"/>
-                              </w:rPr>
-                              <w:t xml:space="preserve">projected growth for landscape architecture</w:t>
+                              <w:t xml:space="preserve">$79,660 </w:t>
+                            </w:r>
+                            <w:r>
+                              <w:rPr>
+                                <w:color w:val="000000"/>
+                              </w:rPr>
+                              <w:t xml:space="preserve">median salary for landscape architects (BLS May 2024)</w:t>
                             </w:r>
                             <w:r>
                               <w:rPr>
@@ -4120,13 +4120,13 @@
                                 <w:b/>
                                 <w:color w:val="000000"/>
                               </w:rPr>
-                              <w:t xml:space="preserve">$73,210 </w:t>
-                            </w:r>
-                            <w:r>
-                              <w:rPr>
-                                <w:color w:val="000000"/>
-                              </w:rPr>
-                              <w:t xml:space="preserve">median salary for landscape architects (BLS)</w:t>
+                              <w:t xml:space="preserve">3% </w:t>
+                            </w:r>
+                            <w:r>
+                              <w:rPr>
+                                <w:color w:val="000000"/>
+                              </w:rPr>
+                              <w:t xml:space="preserve">projected growth 2024-2034 — ~1,700 openings/year (BLS)</w:t>
                             </w:r>
                             <w:r>
                               <w:rPr>
@@ -4177,7 +4177,7 @@
                                 <w:color w:val="000000"/>
                                 <w:sz w:val="18"/>
                               </w:rPr>
-                              <w:t>25,500</w:t>
+                              <w:t>21,800</w:t>
                             </w:r>
                             <w:r>
                               <w:rPr>
@@ -4193,7 +4193,7 @@
                                 <w:color w:val="000000"/>
                                 <w:sz w:val="18"/>
                               </w:rPr>
-                              <w:t>of</w:t>
+                              <w:t xml:space="preserve">total landscape architecture jobs nationwide (BLS 2024)</w:t>
                             </w:r>
                             <w:r>
                               <w:rPr>
@@ -4201,14 +4201,14 @@
                                 <w:spacing w:val="-8"/>
                                 <w:sz w:val="18"/>
                               </w:rPr>
-                              <w:t xml:space="preserve"> </w:t>
+                              <w:t xml:space="preserve"/>
                             </w:r>
                             <w:r>
                               <w:rPr>
                                 <w:color w:val="000000"/>
                                 <w:sz w:val="18"/>
                               </w:rPr>
-                              <w:t>LA</w:t>
+                              <w:t/>
                             </w:r>
                             <w:r>
                               <w:rPr>
@@ -4216,14 +4216,14 @@
                                 <w:spacing w:val="-8"/>
                                 <w:sz w:val="18"/>
                               </w:rPr>
-                              <w:t xml:space="preserve"> </w:t>
+                              <w:t xml:space="preserve"/>
                             </w:r>
                             <w:r>
                               <w:rPr>
                                 <w:color w:val="000000"/>
                                 <w:sz w:val="18"/>
                               </w:rPr>
-                              <w:t>majors</w:t>
+                              <w:t/>
                             </w:r>
                             <w:r>
                               <w:rPr>
@@ -4231,14 +4231,14 @@
                                 <w:spacing w:val="-9"/>
                                 <w:sz w:val="18"/>
                               </w:rPr>
-                              <w:t xml:space="preserve"> </w:t>
+                              <w:t xml:space="preserve"/>
                             </w:r>
                             <w:r>
                               <w:rPr>
                                 <w:color w:val="000000"/>
                                 <w:sz w:val="18"/>
                               </w:rPr>
-                              <w:t>with</w:t>
+                              <w:t/>
                             </w:r>
                             <w:r>
                               <w:rPr>
@@ -4246,14 +4246,14 @@
                                 <w:spacing w:val="-9"/>
                                 <w:sz w:val="18"/>
                               </w:rPr>
-                              <w:t xml:space="preserve"> </w:t>
+                              <w:t xml:space="preserve"/>
                             </w:r>
                             <w:r>
                               <w:rPr>
                                 <w:color w:val="000000"/>
                                 <w:sz w:val="18"/>
                               </w:rPr>
-                              <w:t xml:space="preserve">a concentration in </w:t>
+                              <w:t xml:space="preserve"/>
                             </w:r>
                             <w:r>
                               <w:rPr>
@@ -4261,14 +4261,14 @@
                                 <w:color w:val="000000"/>
                                 <w:sz w:val="18"/>
                               </w:rPr>
-                              <w:t xml:space="preserve">Landscape Design </w:t>
+                              <w:t xml:space="preserve"/>
                             </w:r>
                             <w:r>
                               <w:rPr>
                                 <w:color w:val="000000"/>
                                 <w:sz w:val="18"/>
                               </w:rPr>
-                              <w:t xml:space="preserve">complete leadership roles in student </w:t>
+                              <w:t xml:space="preserve"/>
                             </w:r>
                             <w:r>
                               <w:rPr>
@@ -4276,7 +4276,7 @@
                                 <w:spacing w:val="-2"/>
                                 <w:sz w:val="18"/>
                               </w:rPr>
-                              <w:t>organizations.</w:t>
+                              <w:t>.</w:t>
                             </w:r>
                           </w:p>
                           <w:p>
@@ -4293,7 +4293,7 @@
                                 <w:b/>
                                 <w:color w:val="000000"/>
                               </w:rPr>
-                              <w:t>95%</w:t>
+                              <w:t>1976</w:t>
                             </w:r>
                             <w:r>
                               <w:rPr>
@@ -4410,7 +4410,7 @@
                                 <w:color w:val="000000"/>
                                 <w:sz w:val="18"/>
                               </w:rPr>
-                              <w:t>4-yr</w:t>
+                              <w:t>Only</w:t>
                             </w:r>
                             <w:r>
                               <w:rPr>
@@ -4426,7 +4426,7 @@
                                 <w:color w:val="000000"/>
                                 <w:sz w:val="18"/>
                               </w:rPr>
-                              <w:t xml:space="preserve">LAAB-accredited professional degree with studio-intensive curriculum</w:t>
+                              <w:t xml:space="preserve">HBCU in the nation offering a LAAB-accredited undergraduate BSLA degree</w:t>
                             </w:r>
                             <w:r>
                               <w:rPr>
@@ -4558,7 +4558,7 @@
                                 <w:b/>
                                 <w:color w:val="000000"/>
                               </w:rPr>
-                              <w:t>Only</w:t>
+                              <w:t>24</w:t>
                             </w:r>
                             <w:r>
                               <w:rPr>
@@ -4572,7 +4572,7 @@
                               <w:rPr>
                                 <w:color w:val="000000"/>
                               </w:rPr>
-                              <w:t xml:space="preserve">HBCU in the nation offering LAAB-accredited Landscape Architecture</w:t>
+                              <w:t xml:space="preserve">LDAR studio and lecture courses across the 4-year curriculum</w:t>
                             </w:r>
                             <w:r>
                               <w:rPr>
@@ -4690,13 +4690,13 @@
                           <w:b/>
                           <w:color w:val="000000"/>
                         </w:rPr>
-                        <w:t xml:space="preserve">4% 2022-2032 </w:t>
-                      </w:r>
-                      <w:r>
-                        <w:rPr>
-                          <w:color w:val="000000"/>
-                        </w:rPr>
-                        <w:t xml:space="preserve">projected growth for landscape architecture</w:t>
+                        <w:t xml:space="preserve">$79,660 </w:t>
+                      </w:r>
+                      <w:r>
+                        <w:rPr>
+                          <w:color w:val="000000"/>
+                        </w:rPr>
+                        <w:t xml:space="preserve">median salary for landscape architects (BLS May 2024)</w:t>
                       </w:r>
                       <w:r>
                         <w:rPr>
@@ -4785,13 +4785,13 @@
                           <w:b/>
                           <w:color w:val="000000"/>
                         </w:rPr>
-                        <w:t xml:space="preserve">$73,210 </w:t>
-                      </w:r>
-                      <w:r>
-                        <w:rPr>
-                          <w:color w:val="000000"/>
-                        </w:rPr>
-                        <w:t xml:space="preserve">median salary for landscape architects (BLS)</w:t>
+                        <w:t xml:space="preserve">3% </w:t>
+                      </w:r>
+                      <w:r>
+                        <w:rPr>
+                          <w:color w:val="000000"/>
+                        </w:rPr>
+                        <w:t xml:space="preserve">projected growth 2024-2034 — ~1,700 openings/year (BLS)</w:t>
                       </w:r>
                       <w:r>
                         <w:rPr>
@@ -4842,7 +4842,7 @@
                           <w:color w:val="000000"/>
                           <w:sz w:val="18"/>
                         </w:rPr>
-                        <w:t>25,500</w:t>
+                        <w:t>21,800</w:t>
                       </w:r>
                       <w:r>
                         <w:rPr>
@@ -4858,7 +4858,7 @@
                           <w:color w:val="000000"/>
                           <w:sz w:val="18"/>
                         </w:rPr>
-                        <w:t>of</w:t>
+                        <w:t xml:space="preserve">total landscape architecture jobs nationwide (BLS 2024)</w:t>
                       </w:r>
                       <w:r>
                         <w:rPr>
@@ -4866,14 +4866,14 @@
                           <w:spacing w:val="-8"/>
                           <w:sz w:val="18"/>
                         </w:rPr>
-                        <w:t xml:space="preserve"> </w:t>
+                        <w:t xml:space="preserve"/>
                       </w:r>
                       <w:r>
                         <w:rPr>
                           <w:color w:val="000000"/>
                           <w:sz w:val="18"/>
                         </w:rPr>
-                        <w:t>LA</w:t>
+                        <w:t/>
                       </w:r>
                       <w:r>
                         <w:rPr>
@@ -4881,14 +4881,14 @@
                           <w:spacing w:val="-8"/>
                           <w:sz w:val="18"/>
                         </w:rPr>
-                        <w:t xml:space="preserve"> </w:t>
+                        <w:t xml:space="preserve"/>
                       </w:r>
                       <w:r>
                         <w:rPr>
                           <w:color w:val="000000"/>
                           <w:sz w:val="18"/>
                         </w:rPr>
-                        <w:t>majors</w:t>
+                        <w:t/>
                       </w:r>
                       <w:r>
                         <w:rPr>
@@ -4896,14 +4896,14 @@
                           <w:spacing w:val="-9"/>
                           <w:sz w:val="18"/>
                         </w:rPr>
-                        <w:t xml:space="preserve"> </w:t>
+                        <w:t xml:space="preserve"/>
                       </w:r>
                       <w:r>
                         <w:rPr>
                           <w:color w:val="000000"/>
                           <w:sz w:val="18"/>
                         </w:rPr>
-                        <w:t>with</w:t>
+                        <w:t/>
                       </w:r>
                       <w:r>
                         <w:rPr>
@@ -4911,14 +4911,14 @@
                           <w:spacing w:val="-9"/>
                           <w:sz w:val="18"/>
                         </w:rPr>
-                        <w:t xml:space="preserve"> </w:t>
+                        <w:t xml:space="preserve"/>
                       </w:r>
                       <w:r>
                         <w:rPr>
                           <w:color w:val="000000"/>
                           <w:sz w:val="18"/>
                         </w:rPr>
-                        <w:t xml:space="preserve">a concentration in </w:t>
+                        <w:t xml:space="preserve"/>
                       </w:r>
                       <w:r>
                         <w:rPr>
@@ -4926,14 +4926,14 @@
                           <w:color w:val="000000"/>
                           <w:sz w:val="18"/>
                         </w:rPr>
-                        <w:t xml:space="preserve">Landscape Design </w:t>
+                        <w:t xml:space="preserve"/>
                       </w:r>
                       <w:r>
                         <w:rPr>
                           <w:color w:val="000000"/>
                           <w:sz w:val="18"/>
                         </w:rPr>
-                        <w:t xml:space="preserve">complete leadership roles in student </w:t>
+                        <w:t xml:space="preserve"/>
                       </w:r>
                       <w:r>
                         <w:rPr>
@@ -4941,7 +4941,7 @@
                           <w:spacing w:val="-2"/>
                           <w:sz w:val="18"/>
                         </w:rPr>
-                        <w:t>organizations.</w:t>
+                        <w:t>.</w:t>
                       </w:r>
                     </w:p>
                     <w:p>
@@ -4958,7 +4958,7 @@
                           <w:b/>
                           <w:color w:val="000000"/>
                         </w:rPr>
-                        <w:t>95%</w:t>
+                        <w:t>1976</w:t>
                       </w:r>
                       <w:r>
                         <w:rPr>
@@ -5075,7 +5075,7 @@
                           <w:color w:val="000000"/>
                           <w:sz w:val="18"/>
                         </w:rPr>
-                        <w:t>4-yr</w:t>
+                        <w:t>Only</w:t>
                       </w:r>
                       <w:r>
                         <w:rPr>
@@ -5091,7 +5091,7 @@
                           <w:color w:val="000000"/>
                           <w:sz w:val="18"/>
                         </w:rPr>
-                        <w:t xml:space="preserve">LAAB-accredited professional degree with studio-intensive curriculum</w:t>
+                        <w:t xml:space="preserve">HBCU in the nation offering a LAAB-accredited undergraduate BSLA degree</w:t>
                       </w:r>
                       <w:r>
                         <w:rPr>
@@ -5223,7 +5223,7 @@
                           <w:b/>
                           <w:color w:val="000000"/>
                         </w:rPr>
-                        <w:t>Only</w:t>
+                        <w:t>24</w:t>
                       </w:r>
                       <w:r>
                         <w:rPr>
@@ -5237,7 +5237,7 @@
                         <w:rPr>
                           <w:color w:val="000000"/>
                         </w:rPr>
-                        <w:t xml:space="preserve">HBCU in the nation offering LAAB-accredited Landscape Architecture</w:t>
+                        <w:t xml:space="preserve">LDAR studio and lecture courses across the 4-year curriculum</w:t>
                       </w:r>
                       <w:r>
                         <w:rPr>
@@ -9113,7 +9113,7 @@
                               <w:rPr>
                                 <w:color w:val="000000"/>
                               </w:rPr>
-                              <w:t xml:space="preserve">The Bachelor of Science in Landscape Architecture at NC A&amp;T is a rigorous, studio-intensive professional degree accredited by the Landscape Architectural Accreditation Board (LAAB). Across four years, students progress through a sequenced curriculum of 24 LDAR courses that build competencies in design fundamentals, ecological systems, site engineering, construction documentation, and collaborative professional practice. As the only LAAB-accredited program at a public HBCU, NC A&amp;T uniquely positions graduates to bring underrepresented perspectives to environmental design, green infrastructure, and community-centered planning.</w:t>
+                              <w:t xml:space="preserve">The Bachelor of Science in Landscape Architecture at NC A&amp;T is a rigorous, studio-intensive professional degree accredited by the Landscape Architectural Accreditation Board (LAAB). Established in 1976, the program guides students through a sequenced curriculum of 24 LDAR courses that build competencies in design fundamentals, ecological systems, site engineering, construction documentation, and collaborative professional practice. As the only HBCU in the nation offering a LAAB-accredited undergraduate degree in landscape architecture, NC A&amp;T uniquely positions graduates to bring underrepresented perspectives to environmental design, green infrastructure, and community-centered planning.</w:t>
                             </w:r>
                             <w:r>
                               <w:rPr>
@@ -9652,7 +9652,7 @@
                         <w:rPr>
                           <w:color w:val="000000"/>
                         </w:rPr>
-                        <w:t xml:space="preserve">The Bachelor of Science in Landscape Architecture at NC A&amp;T is a rigorous, studio-intensive professional degree accredited by the Landscape Architectural Accreditation Board (LAAB). Across four years, students progress through a sequenced curriculum of 24 LDAR courses that build competencies in design fundamentals, ecological systems, site engineering, construction documentation, and collaborative professional practice. As the only LAAB-accredited program at a public HBCU, NC A&amp;T uniquely positions graduates to bring underrepresented perspectives to environmental design, green infrastructure, and community-centered planning.</w:t>
+                        <w:t xml:space="preserve">The Bachelor of Science in Landscape Architecture at NC A&amp;T is a rigorous, studio-intensive professional degree accredited by the Landscape Architectural Accreditation Board (LAAB). Established in 1976, the program guides students through a sequenced curriculum of 24 LDAR courses that build competencies in design fundamentals, ecological systems, site engineering, construction documentation, and collaborative professional practice. As the only HBCU in the nation offering a LAAB-accredited undergraduate degree in landscape architecture, NC A&amp;T uniquely positions graduates to bring underrepresented perspectives to environmental design, green infrastructure, and community-centered planning.</w:t>
                       </w:r>
                       <w:r>
                         <w:rPr>
@@ -10898,7 +10898,7 @@
                                 <w:color w:val="000000"/>
                                 <w:sz w:val="17"/>
                               </w:rPr>
-                              <w:t xml:space="preserve">American Society of Landscape Architects (ASLA)  |  Black Landscape Architecture Network (BLAN)</w:t>
+                              <w:t xml:space="preserve">American Society of Landscape Architects (ASLA)  |  Black Landscape Architects Network (BlackLAN)</w:t>
                             </w:r>
                             <w:r>
                               <w:rPr>
@@ -11467,7 +11467,7 @@
                           <w:color w:val="000000"/>
                           <w:sz w:val="17"/>
                         </w:rPr>
-                        <w:t xml:space="preserve">American Society of Landscape Architects (ASLA)  |  Black Landscape Architecture Network (BLAN)</w:t>
+                        <w:t xml:space="preserve">American Society of Landscape Architects (ASLA)  |  Black Landscape Architects Network (BlackLAN)</w:t>
                       </w:r>
                       <w:r>
                         <w:rPr>

</xml_diff>

<commit_message>
fix: fill all 18 study topic paragraphs (practice methods + life skills), all 27 career direction paragraphs (5 subsections), truncate checklist milestones to prevent page 3 overflow
</commit_message>
<xml_diff>
--- a/output/CAES-LA_Experiential_Major_Map.docx
+++ b/output/CAES-LA_Experiential_Major_Map.docx
@@ -752,7 +752,7 @@
                                 <w:color w:val="000000"/>
                                 <w:sz w:val="18"/>
                               </w:rPr>
-                              <w:t>What</w:t>
+                              <w:t xml:space="preserve">What makes landscape architecture unique is its focus on real-world application. You won’t</w:t>
                             </w:r>
                             <w:r>
                               <w:rPr>
@@ -762,7 +762,7 @@
                                 <w:spacing w:val="-6"/>
                                 <w:sz w:val="18"/>
                               </w:rPr>
-                              <w:t xml:space="preserve"> </w:t>
+                              <w:t xml:space="preserve"/>
                             </w:r>
                             <w:r>
                               <w:rPr>
@@ -771,7 +771,7 @@
                                 <w:color w:val="000000"/>
                                 <w:sz w:val="18"/>
                               </w:rPr>
-                              <w:t>makes</w:t>
+                              <w:t/>
                             </w:r>
                             <w:r>
                               <w:rPr>
@@ -781,7 +781,7 @@
                                 <w:spacing w:val="-3"/>
                                 <w:sz w:val="18"/>
                               </w:rPr>
-                              <w:t xml:space="preserve"> </w:t>
+                              <w:t xml:space="preserve"/>
                             </w:r>
                             <w:r>
                               <w:rPr>
@@ -790,7 +790,7 @@
                                 <w:color w:val="000000"/>
                                 <w:sz w:val="18"/>
                               </w:rPr>
-                              <w:t xml:space="preserve">landscape architecture</w:t>
+                              <w:t xml:space="preserve"/>
                             </w:r>
                             <w:r>
                               <w:rPr>
@@ -800,7 +800,7 @@
                                 <w:spacing w:val="-3"/>
                                 <w:sz w:val="18"/>
                               </w:rPr>
-                              <w:t xml:space="preserve"> </w:t>
+                              <w:t xml:space="preserve"/>
                             </w:r>
                             <w:r>
                               <w:rPr>
@@ -809,7 +809,7 @@
                                 <w:color w:val="000000"/>
                                 <w:sz w:val="18"/>
                               </w:rPr>
-                              <w:t>unique</w:t>
+                              <w:t/>
                             </w:r>
                             <w:r>
                               <w:rPr>
@@ -819,7 +819,7 @@
                                 <w:spacing w:val="-3"/>
                                 <w:sz w:val="18"/>
                               </w:rPr>
-                              <w:t xml:space="preserve"> </w:t>
+                              <w:t xml:space="preserve"/>
                             </w:r>
                             <w:r>
                               <w:rPr>
@@ -828,7 +828,7 @@
                                 <w:color w:val="000000"/>
                                 <w:sz w:val="18"/>
                               </w:rPr>
-                              <w:t>is</w:t>
+                              <w:t/>
                             </w:r>
                             <w:r>
                               <w:rPr>
@@ -838,7 +838,7 @@
                                 <w:spacing w:val="-3"/>
                                 <w:sz w:val="18"/>
                               </w:rPr>
-                              <w:t xml:space="preserve"> </w:t>
+                              <w:t xml:space="preserve"/>
                             </w:r>
                             <w:r>
                               <w:rPr>
@@ -847,7 +847,7 @@
                                 <w:color w:val="000000"/>
                                 <w:sz w:val="18"/>
                               </w:rPr>
-                              <w:t>its</w:t>
+                              <w:t/>
                             </w:r>
                             <w:r>
                               <w:rPr>
@@ -857,7 +857,7 @@
                                 <w:spacing w:val="-3"/>
                                 <w:sz w:val="18"/>
                               </w:rPr>
-                              <w:t xml:space="preserve"> </w:t>
+                              <w:t xml:space="preserve"/>
                             </w:r>
                             <w:r>
                               <w:rPr>
@@ -866,7 +866,7 @@
                                 <w:color w:val="000000"/>
                                 <w:sz w:val="18"/>
                               </w:rPr>
-                              <w:t>focus</w:t>
+                              <w:t/>
                             </w:r>
                             <w:r>
                               <w:rPr>
@@ -876,7 +876,7 @@
                                 <w:spacing w:val="-4"/>
                                 <w:sz w:val="18"/>
                               </w:rPr>
-                              <w:t xml:space="preserve"> </w:t>
+                              <w:t xml:space="preserve"/>
                             </w:r>
                             <w:r>
                               <w:rPr>
@@ -885,7 +885,7 @@
                                 <w:color w:val="000000"/>
                                 <w:sz w:val="18"/>
                               </w:rPr>
-                              <w:t>on</w:t>
+                              <w:t/>
                             </w:r>
                             <w:r>
                               <w:rPr>
@@ -895,7 +895,7 @@
                                 <w:spacing w:val="-4"/>
                                 <w:sz w:val="18"/>
                               </w:rPr>
-                              <w:t xml:space="preserve"> </w:t>
+                              <w:t xml:space="preserve"/>
                             </w:r>
                             <w:r>
                               <w:rPr>
@@ -904,7 +904,7 @@
                                 <w:color w:val="000000"/>
                                 <w:sz w:val="18"/>
                               </w:rPr>
-                              <w:t>real-world</w:t>
+                              <w:t/>
                             </w:r>
                             <w:r>
                               <w:rPr>
@@ -914,7 +914,7 @@
                                 <w:spacing w:val="-3"/>
                                 <w:sz w:val="18"/>
                               </w:rPr>
-                              <w:t xml:space="preserve"> </w:t>
+                              <w:t xml:space="preserve"/>
                             </w:r>
                             <w:r>
                               <w:rPr>
@@ -923,7 +923,7 @@
                                 <w:color w:val="000000"/>
                                 <w:sz w:val="18"/>
                               </w:rPr>
-                              <w:t>application.</w:t>
+                              <w:t/>
                             </w:r>
                             <w:r>
                               <w:rPr>
@@ -933,7 +933,7 @@
                                 <w:spacing w:val="-3"/>
                                 <w:sz w:val="18"/>
                               </w:rPr>
-                              <w:t xml:space="preserve"> </w:t>
+                              <w:t xml:space="preserve"/>
                             </w:r>
                             <w:r>
                               <w:rPr>
@@ -942,7 +942,7 @@
                                 <w:color w:val="000000"/>
                                 <w:sz w:val="18"/>
                               </w:rPr>
-                              <w:t>You</w:t>
+                              <w:t/>
                             </w:r>
                             <w:r>
                               <w:rPr>
@@ -952,7 +952,7 @@
                                 <w:spacing w:val="-3"/>
                                 <w:sz w:val="18"/>
                               </w:rPr>
-                              <w:t xml:space="preserve"> </w:t>
+                              <w:t xml:space="preserve"/>
                             </w:r>
                             <w:r>
                               <w:rPr>
@@ -962,7 +962,7 @@
                                 <w:spacing w:val="-2"/>
                                 <w:sz w:val="18"/>
                               </w:rPr>
-                              <w:t>won’t</w:t>
+                              <w:t/>
                             </w:r>
                           </w:p>
                           <w:p>
@@ -983,7 +983,7 @@
                                 <w:color w:val="000000"/>
                                 <w:sz w:val="18"/>
                               </w:rPr>
-                              <w:t>just</w:t>
+                              <w:t xml:space="preserve">just learn theories—you’ll practice them through:</w:t>
                             </w:r>
                             <w:r>
                               <w:rPr>
@@ -993,7 +993,7 @@
                                 <w:spacing w:val="-3"/>
                                 <w:sz w:val="18"/>
                               </w:rPr>
-                              <w:t xml:space="preserve"> </w:t>
+                              <w:t xml:space="preserve"/>
                             </w:r>
                             <w:r>
                               <w:rPr>
@@ -1002,7 +1002,7 @@
                                 <w:color w:val="000000"/>
                                 <w:sz w:val="18"/>
                               </w:rPr>
-                              <w:t>learn</w:t>
+                              <w:t/>
                             </w:r>
                             <w:r>
                               <w:rPr>
@@ -1012,7 +1012,7 @@
                                 <w:spacing w:val="-3"/>
                                 <w:sz w:val="18"/>
                               </w:rPr>
-                              <w:t xml:space="preserve"> </w:t>
+                              <w:t xml:space="preserve"/>
                             </w:r>
                             <w:r>
                               <w:rPr>
@@ -1021,7 +1021,7 @@
                                 <w:color w:val="000000"/>
                                 <w:sz w:val="18"/>
                               </w:rPr>
-                              <w:t>theories—you’ll</w:t>
+                              <w:t/>
                             </w:r>
                             <w:r>
                               <w:rPr>
@@ -1031,7 +1031,7 @@
                                 <w:spacing w:val="-4"/>
                                 <w:sz w:val="18"/>
                               </w:rPr>
-                              <w:t xml:space="preserve"> </w:t>
+                              <w:t xml:space="preserve"/>
                             </w:r>
                             <w:r>
                               <w:rPr>
@@ -1040,7 +1040,7 @@
                                 <w:color w:val="000000"/>
                                 <w:sz w:val="18"/>
                               </w:rPr>
-                              <w:t>practice</w:t>
+                              <w:t/>
                             </w:r>
                             <w:r>
                               <w:rPr>
@@ -1050,7 +1050,7 @@
                                 <w:spacing w:val="-3"/>
                                 <w:sz w:val="18"/>
                               </w:rPr>
-                              <w:t xml:space="preserve"> </w:t>
+                              <w:t xml:space="preserve"/>
                             </w:r>
                             <w:r>
                               <w:rPr>
@@ -1059,7 +1059,7 @@
                                 <w:color w:val="000000"/>
                                 <w:sz w:val="18"/>
                               </w:rPr>
-                              <w:t>them</w:t>
+                              <w:t/>
                             </w:r>
                             <w:r>
                               <w:rPr>
@@ -1069,7 +1069,7 @@
                                 <w:spacing w:val="-2"/>
                                 <w:sz w:val="18"/>
                               </w:rPr>
-                              <w:t xml:space="preserve"> through:</w:t>
+                              <w:t xml:space="preserve"/>
                             </w:r>
                           </w:p>
                           <w:p>
@@ -1092,7 +1092,7 @@
                               <w:rPr>
                                 <w:color w:val="000000"/>
                               </w:rPr>
-                              <w:t xml:space="preserve">Ecology &amp; Sustainability — Designing with natural systems</w:t>
+                              <w:t xml:space="preserve">Studio projects and design critiques</w:t>
                             </w:r>
                             <w:r>
                               <w:rPr>
@@ -1168,7 +1168,7 @@
                               <w:rPr>
                                 <w:color w:val="000000"/>
                               </w:rPr>
-                              <w:t xml:space="preserve">Digital Technology — GIS, CAD, 3D modeling, and visualization</w:t>
+                              <w:t xml:space="preserve">Internships and field experiences</w:t>
                             </w:r>
                             <w:r>
                               <w:rPr>
@@ -1231,7 +1231,7 @@
                               <w:rPr>
                                 <w:color w:val="000000"/>
                               </w:rPr>
-                              <w:t xml:space="preserve">Professional Practice — Contracts, ethics, and business of design</w:t>
+                              <w:t xml:space="preserve">Community engagement and service-learning projects</w:t>
                             </w:r>
                             <w:r>
                               <w:rPr>
@@ -1449,7 +1449,7 @@
                               <w:rPr>
                                 <w:color w:val="000000"/>
                               </w:rPr>
-                              <w:t xml:space="preserve"/>
+                              <w:t xml:space="preserve">Environmental stewardship</w:t>
                             </w:r>
                             <w:r>
                               <w:rPr>
@@ -1487,7 +1487,7 @@
                                 <w:color w:val="000000"/>
                                 <w:spacing w:val="-2"/>
                               </w:rPr>
-                              <w:t xml:space="preserve"/>
+                              <w:t xml:space="preserve">Critical thinking &amp; problem solving</w:t>
                             </w:r>
                           </w:p>
                           <w:p>
@@ -1511,7 +1511,7 @@
                                 <w:color w:val="000000"/>
                                 <w:spacing w:val="-2"/>
                               </w:rPr>
-                              <w:t xml:space="preserve"/>
+                              <w:t xml:space="preserve">Visual communication</w:t>
                             </w:r>
                           </w:p>
                           <w:p>
@@ -1535,7 +1535,7 @@
                                 <w:color w:val="000000"/>
                                 <w:spacing w:val="-2"/>
                               </w:rPr>
-                              <w:t xml:space="preserve"/>
+                              <w:t xml:space="preserve">Technical proficiency (CAD, GIS, 3D)</w:t>
                             </w:r>
                           </w:p>
                           <w:p>
@@ -1558,7 +1558,7 @@
                               <w:rPr>
                                 <w:color w:val="000000"/>
                               </w:rPr>
-                              <w:t xml:space="preserve"/>
+                              <w:t xml:space="preserve">Collaboration &amp; teamwork</w:t>
                             </w:r>
                             <w:r>
                               <w:rPr>
@@ -1589,7 +1589,7 @@
                                 <w:color w:val="000000"/>
                                 <w:spacing w:val="-2"/>
                               </w:rPr>
-                              <w:t xml:space="preserve"/>
+                              <w:t xml:space="preserve">Professional ethics</w:t>
                             </w:r>
                           </w:p>
                         </w:txbxContent>
@@ -2310,7 +2310,7 @@
                           <w:color w:val="000000"/>
                           <w:sz w:val="18"/>
                         </w:rPr>
-                        <w:t>What</w:t>
+                        <w:t xml:space="preserve">What makes landscape architecture unique is its focus on real-world application. You won’t</w:t>
                       </w:r>
                       <w:r>
                         <w:rPr>
@@ -2320,7 +2320,7 @@
                           <w:spacing w:val="-6"/>
                           <w:sz w:val="18"/>
                         </w:rPr>
-                        <w:t xml:space="preserve"> </w:t>
+                        <w:t xml:space="preserve"/>
                       </w:r>
                       <w:r>
                         <w:rPr>
@@ -2329,7 +2329,7 @@
                           <w:color w:val="000000"/>
                           <w:sz w:val="18"/>
                         </w:rPr>
-                        <w:t>makes</w:t>
+                        <w:t/>
                       </w:r>
                       <w:r>
                         <w:rPr>
@@ -2339,7 +2339,7 @@
                           <w:spacing w:val="-3"/>
                           <w:sz w:val="18"/>
                         </w:rPr>
-                        <w:t xml:space="preserve"> </w:t>
+                        <w:t xml:space="preserve"/>
                       </w:r>
                       <w:r>
                         <w:rPr>
@@ -2348,7 +2348,7 @@
                           <w:color w:val="000000"/>
                           <w:sz w:val="18"/>
                         </w:rPr>
-                        <w:t xml:space="preserve">landscape architecture</w:t>
+                        <w:t xml:space="preserve"/>
                       </w:r>
                       <w:r>
                         <w:rPr>
@@ -2358,7 +2358,7 @@
                           <w:spacing w:val="-3"/>
                           <w:sz w:val="18"/>
                         </w:rPr>
-                        <w:t xml:space="preserve"> </w:t>
+                        <w:t xml:space="preserve"/>
                       </w:r>
                       <w:r>
                         <w:rPr>
@@ -2367,7 +2367,7 @@
                           <w:color w:val="000000"/>
                           <w:sz w:val="18"/>
                         </w:rPr>
-                        <w:t>unique</w:t>
+                        <w:t/>
                       </w:r>
                       <w:r>
                         <w:rPr>
@@ -2377,7 +2377,7 @@
                           <w:spacing w:val="-3"/>
                           <w:sz w:val="18"/>
                         </w:rPr>
-                        <w:t xml:space="preserve"> </w:t>
+                        <w:t xml:space="preserve"/>
                       </w:r>
                       <w:r>
                         <w:rPr>
@@ -2386,7 +2386,7 @@
                           <w:color w:val="000000"/>
                           <w:sz w:val="18"/>
                         </w:rPr>
-                        <w:t>is</w:t>
+                        <w:t/>
                       </w:r>
                       <w:r>
                         <w:rPr>
@@ -2396,7 +2396,7 @@
                           <w:spacing w:val="-3"/>
                           <w:sz w:val="18"/>
                         </w:rPr>
-                        <w:t xml:space="preserve"> </w:t>
+                        <w:t xml:space="preserve"/>
                       </w:r>
                       <w:r>
                         <w:rPr>
@@ -2405,7 +2405,7 @@
                           <w:color w:val="000000"/>
                           <w:sz w:val="18"/>
                         </w:rPr>
-                        <w:t>its</w:t>
+                        <w:t/>
                       </w:r>
                       <w:r>
                         <w:rPr>
@@ -2415,7 +2415,7 @@
                           <w:spacing w:val="-3"/>
                           <w:sz w:val="18"/>
                         </w:rPr>
-                        <w:t xml:space="preserve"> </w:t>
+                        <w:t xml:space="preserve"/>
                       </w:r>
                       <w:r>
                         <w:rPr>
@@ -2424,7 +2424,7 @@
                           <w:color w:val="000000"/>
                           <w:sz w:val="18"/>
                         </w:rPr>
-                        <w:t>focus</w:t>
+                        <w:t/>
                       </w:r>
                       <w:r>
                         <w:rPr>
@@ -2434,7 +2434,7 @@
                           <w:spacing w:val="-4"/>
                           <w:sz w:val="18"/>
                         </w:rPr>
-                        <w:t xml:space="preserve"> </w:t>
+                        <w:t xml:space="preserve"/>
                       </w:r>
                       <w:r>
                         <w:rPr>
@@ -2443,7 +2443,7 @@
                           <w:color w:val="000000"/>
                           <w:sz w:val="18"/>
                         </w:rPr>
-                        <w:t>on</w:t>
+                        <w:t/>
                       </w:r>
                       <w:r>
                         <w:rPr>
@@ -2453,7 +2453,7 @@
                           <w:spacing w:val="-4"/>
                           <w:sz w:val="18"/>
                         </w:rPr>
-                        <w:t xml:space="preserve"> </w:t>
+                        <w:t xml:space="preserve"/>
                       </w:r>
                       <w:r>
                         <w:rPr>
@@ -2462,7 +2462,7 @@
                           <w:color w:val="000000"/>
                           <w:sz w:val="18"/>
                         </w:rPr>
-                        <w:t>real-world</w:t>
+                        <w:t/>
                       </w:r>
                       <w:r>
                         <w:rPr>
@@ -2472,7 +2472,7 @@
                           <w:spacing w:val="-3"/>
                           <w:sz w:val="18"/>
                         </w:rPr>
-                        <w:t xml:space="preserve"> </w:t>
+                        <w:t xml:space="preserve"/>
                       </w:r>
                       <w:r>
                         <w:rPr>
@@ -2481,7 +2481,7 @@
                           <w:color w:val="000000"/>
                           <w:sz w:val="18"/>
                         </w:rPr>
-                        <w:t>application.</w:t>
+                        <w:t/>
                       </w:r>
                       <w:r>
                         <w:rPr>
@@ -2491,7 +2491,7 @@
                           <w:spacing w:val="-3"/>
                           <w:sz w:val="18"/>
                         </w:rPr>
-                        <w:t xml:space="preserve"> </w:t>
+                        <w:t xml:space="preserve"/>
                       </w:r>
                       <w:r>
                         <w:rPr>
@@ -2500,7 +2500,7 @@
                           <w:color w:val="000000"/>
                           <w:sz w:val="18"/>
                         </w:rPr>
-                        <w:t>You</w:t>
+                        <w:t/>
                       </w:r>
                       <w:r>
                         <w:rPr>
@@ -2510,7 +2510,7 @@
                           <w:spacing w:val="-3"/>
                           <w:sz w:val="18"/>
                         </w:rPr>
-                        <w:t xml:space="preserve"> </w:t>
+                        <w:t xml:space="preserve"/>
                       </w:r>
                       <w:r>
                         <w:rPr>
@@ -2520,7 +2520,7 @@
                           <w:spacing w:val="-2"/>
                           <w:sz w:val="18"/>
                         </w:rPr>
-                        <w:t>won’t</w:t>
+                        <w:t/>
                       </w:r>
                     </w:p>
                     <w:p>
@@ -2541,7 +2541,7 @@
                           <w:color w:val="000000"/>
                           <w:sz w:val="18"/>
                         </w:rPr>
-                        <w:t>just</w:t>
+                        <w:t xml:space="preserve">just learn theories—you’ll practice them through:</w:t>
                       </w:r>
                       <w:r>
                         <w:rPr>
@@ -2551,7 +2551,7 @@
                           <w:spacing w:val="-3"/>
                           <w:sz w:val="18"/>
                         </w:rPr>
-                        <w:t xml:space="preserve"> </w:t>
+                        <w:t xml:space="preserve"/>
                       </w:r>
                       <w:r>
                         <w:rPr>
@@ -2560,7 +2560,7 @@
                           <w:color w:val="000000"/>
                           <w:sz w:val="18"/>
                         </w:rPr>
-                        <w:t>learn</w:t>
+                        <w:t/>
                       </w:r>
                       <w:r>
                         <w:rPr>
@@ -2570,7 +2570,7 @@
                           <w:spacing w:val="-3"/>
                           <w:sz w:val="18"/>
                         </w:rPr>
-                        <w:t xml:space="preserve"> </w:t>
+                        <w:t xml:space="preserve"/>
                       </w:r>
                       <w:r>
                         <w:rPr>
@@ -2579,7 +2579,7 @@
                           <w:color w:val="000000"/>
                           <w:sz w:val="18"/>
                         </w:rPr>
-                        <w:t>theories—you’ll</w:t>
+                        <w:t/>
                       </w:r>
                       <w:r>
                         <w:rPr>
@@ -2589,7 +2589,7 @@
                           <w:spacing w:val="-4"/>
                           <w:sz w:val="18"/>
                         </w:rPr>
-                        <w:t xml:space="preserve"> </w:t>
+                        <w:t xml:space="preserve"/>
                       </w:r>
                       <w:r>
                         <w:rPr>
@@ -2598,7 +2598,7 @@
                           <w:color w:val="000000"/>
                           <w:sz w:val="18"/>
                         </w:rPr>
-                        <w:t>practice</w:t>
+                        <w:t/>
                       </w:r>
                       <w:r>
                         <w:rPr>
@@ -2608,7 +2608,7 @@
                           <w:spacing w:val="-3"/>
                           <w:sz w:val="18"/>
                         </w:rPr>
-                        <w:t xml:space="preserve"> </w:t>
+                        <w:t xml:space="preserve"/>
                       </w:r>
                       <w:r>
                         <w:rPr>
@@ -2617,7 +2617,7 @@
                           <w:color w:val="000000"/>
                           <w:sz w:val="18"/>
                         </w:rPr>
-                        <w:t>them</w:t>
+                        <w:t/>
                       </w:r>
                       <w:r>
                         <w:rPr>
@@ -2627,7 +2627,7 @@
                           <w:spacing w:val="-2"/>
                           <w:sz w:val="18"/>
                         </w:rPr>
-                        <w:t xml:space="preserve"> through:</w:t>
+                        <w:t xml:space="preserve"/>
                       </w:r>
                     </w:p>
                     <w:p>
@@ -2650,7 +2650,7 @@
                         <w:rPr>
                           <w:color w:val="000000"/>
                         </w:rPr>
-                        <w:t xml:space="preserve">Ecology &amp; Sustainability — Designing with natural systems</w:t>
+                        <w:t xml:space="preserve">Studio projects and design critiques</w:t>
                       </w:r>
                       <w:r>
                         <w:rPr>
@@ -2726,7 +2726,7 @@
                         <w:rPr>
                           <w:color w:val="000000"/>
                         </w:rPr>
-                        <w:t xml:space="preserve">Digital Technology — GIS, CAD, 3D modeling, and visualization</w:t>
+                        <w:t xml:space="preserve">Internships and field experiences</w:t>
                       </w:r>
                       <w:r>
                         <w:rPr>
@@ -2789,7 +2789,7 @@
                         <w:rPr>
                           <w:color w:val="000000"/>
                         </w:rPr>
-                        <w:t xml:space="preserve">Professional Practice — Contracts, ethics, and business of design</w:t>
+                        <w:t xml:space="preserve">Community engagement and service-learning projects</w:t>
                       </w:r>
                       <w:r>
                         <w:rPr>
@@ -3007,7 +3007,7 @@
                         <w:rPr>
                           <w:color w:val="000000"/>
                         </w:rPr>
-                        <w:t xml:space="preserve"/>
+                        <w:t xml:space="preserve">Environmental stewardship</w:t>
                       </w:r>
                       <w:r>
                         <w:rPr>
@@ -3045,7 +3045,7 @@
                           <w:color w:val="000000"/>
                           <w:spacing w:val="-2"/>
                         </w:rPr>
-                        <w:t xml:space="preserve"/>
+                        <w:t xml:space="preserve">Critical thinking &amp; problem solving</w:t>
                       </w:r>
                     </w:p>
                     <w:p>
@@ -3069,7 +3069,7 @@
                           <w:color w:val="000000"/>
                           <w:spacing w:val="-2"/>
                         </w:rPr>
-                        <w:t xml:space="preserve"/>
+                        <w:t xml:space="preserve">Visual communication</w:t>
                       </w:r>
                     </w:p>
                     <w:p>
@@ -3093,7 +3093,7 @@
                           <w:color w:val="000000"/>
                           <w:spacing w:val="-2"/>
                         </w:rPr>
-                        <w:t xml:space="preserve"/>
+                        <w:t xml:space="preserve">Technical proficiency (CAD, GIS, 3D)</w:t>
                       </w:r>
                     </w:p>
                     <w:p>
@@ -3116,7 +3116,7 @@
                         <w:rPr>
                           <w:color w:val="000000"/>
                         </w:rPr>
-                        <w:t xml:space="preserve"/>
+                        <w:t xml:space="preserve">Collaboration &amp; teamwork</w:t>
                       </w:r>
                       <w:r>
                         <w:rPr>
@@ -3147,7 +3147,7 @@
                           <w:color w:val="000000"/>
                           <w:spacing w:val="-2"/>
                         </w:rPr>
-                        <w:t xml:space="preserve"/>
+                        <w:t xml:space="preserve">Professional ethics</w:t>
                       </w:r>
                     </w:p>
                   </w:txbxContent>
@@ -5463,176 +5463,176 @@
                               <w:rPr>
                                 <w:color w:val="000000"/>
                               </w:rPr>
-                              <w:t xml:space="preserve">One of the best things about a landscape architecture degree is flexibility—it prepares you for lots of different careers, across industries. Instead of locking</w:t>
+                              <w:t xml:space="preserve">One of the best things about a landscape architecture degree is flexibility—it prepares you for careers in design firms, government agencies, nonprofits, and more. Instead of locking you into one path, it gives you skills you can apply across many fields.</w:t>
                             </w:r>
                             <w:r>
                               <w:rPr>
                                 <w:color w:val="000000"/>
                                 <w:spacing w:val="-4"/>
                               </w:rPr>
-                              <w:t xml:space="preserve"> </w:t>
-                            </w:r>
-                            <w:r>
-                              <w:rPr>
-                                <w:color w:val="000000"/>
-                              </w:rPr>
-                              <w:t>you</w:t>
+                              <w:t xml:space="preserve"/>
+                            </w:r>
+                            <w:r>
+                              <w:rPr>
+                                <w:color w:val="000000"/>
+                              </w:rPr>
+                              <w:t/>
                             </w:r>
                             <w:r>
                               <w:rPr>
                                 <w:color w:val="000000"/>
                                 <w:spacing w:val="-4"/>
                               </w:rPr>
-                              <w:t xml:space="preserve"> </w:t>
-                            </w:r>
-                            <w:r>
-                              <w:rPr>
-                                <w:color w:val="000000"/>
-                              </w:rPr>
-                              <w:t>into</w:t>
+                              <w:t xml:space="preserve"/>
+                            </w:r>
+                            <w:r>
+                              <w:rPr>
+                                <w:color w:val="000000"/>
+                              </w:rPr>
+                              <w:t/>
                             </w:r>
                             <w:r>
                               <w:rPr>
                                 <w:color w:val="000000"/>
                                 <w:spacing w:val="-3"/>
                               </w:rPr>
-                              <w:t xml:space="preserve"> </w:t>
-                            </w:r>
-                            <w:r>
-                              <w:rPr>
-                                <w:color w:val="000000"/>
-                              </w:rPr>
-                              <w:t>one</w:t>
+                              <w:t xml:space="preserve"/>
+                            </w:r>
+                            <w:r>
+                              <w:rPr>
+                                <w:color w:val="000000"/>
+                              </w:rPr>
+                              <w:t/>
                             </w:r>
                             <w:r>
                               <w:rPr>
                                 <w:color w:val="000000"/>
                                 <w:spacing w:val="-4"/>
                               </w:rPr>
-                              <w:t xml:space="preserve"> </w:t>
-                            </w:r>
-                            <w:r>
-                              <w:rPr>
-                                <w:color w:val="000000"/>
-                              </w:rPr>
-                              <w:t>path,</w:t>
+                              <w:t xml:space="preserve"/>
+                            </w:r>
+                            <w:r>
+                              <w:rPr>
+                                <w:color w:val="000000"/>
+                              </w:rPr>
+                              <w:t/>
                             </w:r>
                             <w:r>
                               <w:rPr>
                                 <w:color w:val="000000"/>
                                 <w:spacing w:val="-3"/>
                               </w:rPr>
-                              <w:t xml:space="preserve"> </w:t>
-                            </w:r>
-                            <w:r>
-                              <w:rPr>
-                                <w:color w:val="000000"/>
-                              </w:rPr>
-                              <w:t>it</w:t>
+                              <w:t xml:space="preserve"/>
+                            </w:r>
+                            <w:r>
+                              <w:rPr>
+                                <w:color w:val="000000"/>
+                              </w:rPr>
+                              <w:t/>
                             </w:r>
                             <w:r>
                               <w:rPr>
                                 <w:color w:val="000000"/>
                                 <w:spacing w:val="-4"/>
                               </w:rPr>
-                              <w:t xml:space="preserve"> </w:t>
-                            </w:r>
-                            <w:r>
-                              <w:rPr>
-                                <w:color w:val="000000"/>
-                              </w:rPr>
-                              <w:t>gives</w:t>
+                              <w:t xml:space="preserve"/>
+                            </w:r>
+                            <w:r>
+                              <w:rPr>
+                                <w:color w:val="000000"/>
+                              </w:rPr>
+                              <w:t/>
                             </w:r>
                             <w:r>
                               <w:rPr>
                                 <w:color w:val="000000"/>
                                 <w:spacing w:val="-2"/>
                               </w:rPr>
-                              <w:t xml:space="preserve"> </w:t>
-                            </w:r>
-                            <w:r>
-                              <w:rPr>
-                                <w:color w:val="000000"/>
-                              </w:rPr>
-                              <w:t>you</w:t>
+                              <w:t xml:space="preserve"/>
+                            </w:r>
+                            <w:r>
+                              <w:rPr>
+                                <w:color w:val="000000"/>
+                              </w:rPr>
+                              <w:t/>
                             </w:r>
                             <w:r>
                               <w:rPr>
                                 <w:color w:val="000000"/>
                                 <w:spacing w:val="-4"/>
                               </w:rPr>
-                              <w:t xml:space="preserve"> </w:t>
-                            </w:r>
-                            <w:r>
-                              <w:rPr>
-                                <w:color w:val="000000"/>
-                              </w:rPr>
-                              <w:t>skills</w:t>
+                              <w:t xml:space="preserve"/>
+                            </w:r>
+                            <w:r>
+                              <w:rPr>
+                                <w:color w:val="000000"/>
+                              </w:rPr>
+                              <w:t/>
                             </w:r>
                             <w:r>
                               <w:rPr>
                                 <w:color w:val="000000"/>
                                 <w:spacing w:val="-4"/>
                               </w:rPr>
-                              <w:t xml:space="preserve"> </w:t>
-                            </w:r>
-                            <w:r>
-                              <w:rPr>
-                                <w:color w:val="000000"/>
-                              </w:rPr>
-                              <w:t>you</w:t>
+                              <w:t xml:space="preserve"/>
+                            </w:r>
+                            <w:r>
+                              <w:rPr>
+                                <w:color w:val="000000"/>
+                              </w:rPr>
+                              <w:t/>
                             </w:r>
                             <w:r>
                               <w:rPr>
                                 <w:color w:val="000000"/>
                                 <w:spacing w:val="-4"/>
                               </w:rPr>
-                              <w:t xml:space="preserve"> </w:t>
-                            </w:r>
-                            <w:r>
-                              <w:rPr>
-                                <w:color w:val="000000"/>
-                              </w:rPr>
-                              <w:t>can</w:t>
+                              <w:t xml:space="preserve"/>
+                            </w:r>
+                            <w:r>
+                              <w:rPr>
+                                <w:color w:val="000000"/>
+                              </w:rPr>
+                              <w:t/>
                             </w:r>
                             <w:r>
                               <w:rPr>
                                 <w:color w:val="000000"/>
                                 <w:spacing w:val="-4"/>
                               </w:rPr>
-                              <w:t xml:space="preserve"> </w:t>
-                            </w:r>
-                            <w:r>
-                              <w:rPr>
-                                <w:color w:val="000000"/>
-                              </w:rPr>
-                              <w:t>use</w:t>
+                              <w:t xml:space="preserve"/>
+                            </w:r>
+                            <w:r>
+                              <w:rPr>
+                                <w:color w:val="000000"/>
+                              </w:rPr>
+                              <w:t/>
                             </w:r>
                             <w:r>
                               <w:rPr>
                                 <w:color w:val="000000"/>
                                 <w:spacing w:val="-4"/>
                               </w:rPr>
-                              <w:t xml:space="preserve"> </w:t>
-                            </w:r>
-                            <w:r>
-                              <w:rPr>
-                                <w:color w:val="000000"/>
-                              </w:rPr>
-                              <w:t>almost</w:t>
+                              <w:t xml:space="preserve"/>
+                            </w:r>
+                            <w:r>
+                              <w:rPr>
+                                <w:color w:val="000000"/>
+                              </w:rPr>
+                              <w:t/>
                             </w:r>
                             <w:r>
                               <w:rPr>
                                 <w:color w:val="000000"/>
                                 <w:spacing w:val="-3"/>
                               </w:rPr>
-                              <w:t xml:space="preserve"> </w:t>
-                            </w:r>
-                            <w:r>
-                              <w:rPr>
-                                <w:color w:val="000000"/>
-                              </w:rPr>
-                              <w:t xml:space="preserve">anywhere. Here are some common directions landscape architecture students go:</w:t>
+                              <w:t xml:space="preserve"/>
+                            </w:r>
+                            <w:r>
+                              <w:rPr>
+                                <w:color w:val="000000"/>
+                              </w:rPr>
+                              <w:t xml:space="preserve"/>
                             </w:r>
                           </w:p>
                           <w:p>
@@ -5661,7 +5661,7 @@
                                 <w:color w:val="000000"/>
                                 <w:sz w:val="18"/>
                               </w:rPr>
-                              <w:t>💼</w:t>
+                              <w:t xml:space="preserve">🏗️ Design Practice</w:t>
                             </w:r>
                             <w:r>
                               <w:rPr>
@@ -5671,7 +5671,7 @@
                                 <w:spacing w:val="-11"/>
                                 <w:sz w:val="18"/>
                               </w:rPr>
-                              <w:t xml:space="preserve"> </w:t>
+                              <w:t xml:space="preserve"/>
                             </w:r>
                             <w:r>
                               <w:rPr>
@@ -5679,7 +5679,7 @@
                                 <w:color w:val="000000"/>
                                 <w:sz w:val="18"/>
                               </w:rPr>
-                              <w:t xml:space="preserve">Design Practice</w:t>
+                              <w:t xml:space="preserve"/>
                             </w:r>
                             <w:r>
                               <w:rPr>
@@ -5841,7 +5841,7 @@
                               <w:rPr>
                                 <w:color w:val="000000"/>
                               </w:rPr>
-                              <w:t xml:space="preserve">Project Manager</w:t>
+                              <w:t xml:space="preserve">Designing parks, campuses, streetscapes, and public spaces</w:t>
                             </w:r>
                             <w:r>
                               <w:rPr>
@@ -5920,7 +5920,7 @@
                                 <w:color w:val="000000"/>
                                 <w:sz w:val="18"/>
                               </w:rPr>
-                              <w:t>👥</w:t>
+                              <w:t xml:space="preserve">🌿 Environmental Planning &amp; Restoration</w:t>
                             </w:r>
                             <w:r>
                               <w:rPr>
@@ -5930,7 +5930,7 @@
                                 <w:spacing w:val="-12"/>
                                 <w:sz w:val="18"/>
                               </w:rPr>
-                              <w:t xml:space="preserve"> </w:t>
+                              <w:t xml:space="preserve"/>
                             </w:r>
                             <w:r>
                               <w:rPr>
@@ -5938,7 +5938,7 @@
                                 <w:color w:val="000000"/>
                                 <w:sz w:val="18"/>
                               </w:rPr>
-                              <w:t>Human</w:t>
+                              <w:t/>
                             </w:r>
                             <w:r>
                               <w:rPr>
@@ -5947,7 +5947,7 @@
                                 <w:spacing w:val="-3"/>
                                 <w:sz w:val="18"/>
                               </w:rPr>
-                              <w:t xml:space="preserve"> </w:t>
+                              <w:t xml:space="preserve"/>
                             </w:r>
                             <w:r>
                               <w:rPr>
@@ -5955,7 +5955,7 @@
                                 <w:color w:val="000000"/>
                                 <w:sz w:val="18"/>
                               </w:rPr>
-                              <w:t>Resources</w:t>
+                              <w:t/>
                             </w:r>
                             <w:r>
                               <w:rPr>
@@ -5964,7 +5964,7 @@
                                 <w:spacing w:val="-1"/>
                                 <w:sz w:val="18"/>
                               </w:rPr>
-                              <w:t xml:space="preserve"> </w:t>
+                              <w:t xml:space="preserve"/>
                             </w:r>
                             <w:r>
                               <w:rPr>
@@ -5973,7 +5973,7 @@
                                 <w:spacing w:val="-4"/>
                                 <w:sz w:val="18"/>
                               </w:rPr>
-                              <w:t>(HR)</w:t>
+                              <w:t/>
                             </w:r>
                           </w:p>
                           <w:p>
@@ -5996,7 +5996,7 @@
                               <w:rPr>
                                 <w:color w:val="000000"/>
                               </w:rPr>
-                              <w:t xml:space="preserve">Parks &amp; Recreation Planner</w:t>
+                              <w:t xml:space="preserve">Green Infrastructure Specialist</w:t>
                             </w:r>
                             <w:r>
                               <w:rPr>
@@ -6059,7 +6059,7 @@
                               <w:rPr>
                                 <w:color w:val="000000"/>
                               </w:rPr>
-                              <w:t xml:space="preserve">Green Infrastructure Specialist</w:t>
+                              <w:t xml:space="preserve">Environmental Restoration Designer</w:t>
                             </w:r>
                             <w:r>
                               <w:rPr>
@@ -6109,7 +6109,7 @@
                               <w:rPr>
                                 <w:color w:val="000000"/>
                               </w:rPr>
-                              <w:t xml:space="preserve">Environmental Restoration Designer</w:t>
+                              <w:t xml:space="preserve">Stormwater Management Designer</w:t>
                             </w:r>
                             <w:r>
                               <w:rPr>
@@ -6165,7 +6165,7 @@
                                 <w:color w:val="000000"/>
                                 <w:sz w:val="18"/>
                               </w:rPr>
-                              <w:t>📊</w:t>
+                              <w:t xml:space="preserve">🏛️ Government &amp; Public Sector</w:t>
                             </w:r>
                             <w:r>
                               <w:rPr>
@@ -6175,7 +6175,7 @@
                                 <w:spacing w:val="-13"/>
                                 <w:sz w:val="18"/>
                               </w:rPr>
-                              <w:t xml:space="preserve"> </w:t>
+                              <w:t xml:space="preserve"/>
                             </w:r>
                             <w:r>
                               <w:rPr>
@@ -6183,7 +6183,7 @@
                                 <w:color w:val="000000"/>
                                 <w:sz w:val="18"/>
                               </w:rPr>
-                              <w:t xml:space="preserve">Environmental Planning &amp; Design</w:t>
+                              <w:t xml:space="preserve"/>
                             </w:r>
                             <w:r>
                               <w:rPr>
@@ -6258,7 +6258,7 @@
                               <w:rPr>
                                 <w:color w:val="000000"/>
                               </w:rPr>
-                              <w:t xml:space="preserve">Land Development Consultant</w:t>
+                              <w:t xml:space="preserve">Parks &amp; Recreation Planner</w:t>
                             </w:r>
                             <w:r>
                               <w:rPr>
@@ -6353,7 +6353,7 @@
                               <w:rPr>
                                 <w:color w:val="000000"/>
                               </w:rPr>
-                              <w:t xml:space="preserve">Stormwater Management Designer</w:t>
+                              <w:t xml:space="preserve">Campus &amp; Institutional Planner</w:t>
                             </w:r>
                             <w:r>
                               <w:rPr>
@@ -6442,7 +6442,7 @@
                               <w:rPr>
                                 <w:color w:val="000000"/>
                               </w:rPr>
-                              <w:t xml:space="preserve">Campus &amp; Institutional Planner</w:t>
+                              <w:t xml:space="preserve">Working with NPS, NRCS/USDA, State DOTs, and municipal agencies</w:t>
                             </w:r>
                             <w:r>
                               <w:rPr>
@@ -6557,7 +6557,7 @@
                               <w:rPr>
                                 <w:color w:val="000000"/>
                               </w:rPr>
-                              <w:t xml:space="preserve"/>
+                              <w:t xml:space="preserve">Shaping policy on green infrastructure and public space</w:t>
                             </w:r>
                             <w:r>
                               <w:rPr>
@@ -6664,7 +6664,7 @@
                                 <w:color w:val="000000"/>
                                 <w:sz w:val="18"/>
                               </w:rPr>
-                              <w:t>💡</w:t>
+                              <w:t xml:space="preserve">💼 Consulting &amp; Private Development</w:t>
                             </w:r>
                             <w:r>
                               <w:rPr>
@@ -6674,7 +6674,7 @@
                                 <w:spacing w:val="-10"/>
                                 <w:sz w:val="18"/>
                               </w:rPr>
-                              <w:t xml:space="preserve"> </w:t>
+                              <w:t xml:space="preserve"/>
                             </w:r>
                             <w:r>
                               <w:rPr>
@@ -6683,7 +6683,7 @@
                                 <w:spacing w:val="-2"/>
                                 <w:sz w:val="18"/>
                               </w:rPr>
-                              <w:t xml:space="preserve">Ecological Design</w:t>
+                              <w:t xml:space="preserve"/>
                             </w:r>
                           </w:p>
                           <w:p>
@@ -6706,7 +6706,7 @@
                               <w:rPr>
                                 <w:color w:val="000000"/>
                               </w:rPr>
-                              <w:t xml:space="preserve"/>
+                              <w:t xml:space="preserve">Project Manager</w:t>
                             </w:r>
                             <w:r>
                               <w:rPr>
@@ -6762,7 +6762,7 @@
                               <w:rPr>
                                 <w:color w:val="000000"/>
                               </w:rPr>
-                              <w:t xml:space="preserve"/>
+                              <w:t xml:space="preserve">Land Development Consultant</w:t>
                             </w:r>
                             <w:r>
                               <w:rPr>
@@ -6851,7 +6851,7 @@
                               <w:rPr>
                                 <w:color w:val="000000"/>
                               </w:rPr>
-                              <w:t xml:space="preserve"/>
+                              <w:t xml:space="preserve">Working with firms like AECOM, SWA, Sasaki, HOK, Design Workshop</w:t>
                             </w:r>
                             <w:r>
                               <w:rPr>
@@ -6923,7 +6923,7 @@
                                 <w:rFonts w:ascii="Segoe UI Emoji" w:eastAsia="Segoe UI Emoji"/>
                                 <w:color w:val="000000"/>
                               </w:rPr>
-                              <w:t>🌎</w:t>
+                              <w:t xml:space="preserve">📝 Licensure &amp; Advanced Practice</w:t>
                             </w:r>
                             <w:r>
                               <w:rPr>
@@ -6931,13 +6931,13 @@
                                 <w:color w:val="000000"/>
                                 <w:spacing w:val="-12"/>
                               </w:rPr>
-                              <w:t xml:space="preserve"> </w:t>
-                            </w:r>
-                            <w:r>
-                              <w:rPr>
-                                <w:color w:val="000000"/>
-                              </w:rPr>
-                              <w:t xml:space="preserve">Public Sector &amp; Community Design</w:t>
+                              <w:t xml:space="preserve"/>
+                            </w:r>
+                            <w:r>
+                              <w:rPr>
+                                <w:color w:val="000000"/>
+                              </w:rPr>
+                              <w:t xml:space="preserve"/>
                             </w:r>
                             <w:r>
                               <w:rPr>
@@ -6993,7 +6993,7 @@
                               <w:rPr>
                                 <w:color w:val="000000"/>
                               </w:rPr>
-                              <w:t xml:space="preserve"/>
+                              <w:t xml:space="preserve">Pursue LARE licensure after 4 years of professional experience</w:t>
                             </w:r>
                             <w:r>
                               <w:rPr>
@@ -7108,7 +7108,7 @@
                               <w:rPr>
                                 <w:color w:val="000000"/>
                               </w:rPr>
-                              <w:t xml:space="preserve"/>
+                              <w:t xml:space="preserve">Advance to principal, partner, or department head roles</w:t>
                             </w:r>
                             <w:r>
                               <w:rPr>
@@ -7301,176 +7301,176 @@
                         <w:rPr>
                           <w:color w:val="000000"/>
                         </w:rPr>
-                        <w:t xml:space="preserve">One of the best things about a landscape architecture degree is flexibility—it prepares you for lots of different careers, across industries. Instead of locking</w:t>
+                        <w:t xml:space="preserve">One of the best things about a landscape architecture degree is flexibility—it prepares you for careers in design firms, government agencies, nonprofits, and more. Instead of locking you into one path, it gives you skills you can apply across many fields.</w:t>
                       </w:r>
                       <w:r>
                         <w:rPr>
                           <w:color w:val="000000"/>
                           <w:spacing w:val="-4"/>
                         </w:rPr>
-                        <w:t xml:space="preserve"> </w:t>
-                      </w:r>
-                      <w:r>
-                        <w:rPr>
-                          <w:color w:val="000000"/>
-                        </w:rPr>
-                        <w:t>you</w:t>
+                        <w:t xml:space="preserve"/>
+                      </w:r>
+                      <w:r>
+                        <w:rPr>
+                          <w:color w:val="000000"/>
+                        </w:rPr>
+                        <w:t/>
                       </w:r>
                       <w:r>
                         <w:rPr>
                           <w:color w:val="000000"/>
                           <w:spacing w:val="-4"/>
                         </w:rPr>
-                        <w:t xml:space="preserve"> </w:t>
-                      </w:r>
-                      <w:r>
-                        <w:rPr>
-                          <w:color w:val="000000"/>
-                        </w:rPr>
-                        <w:t>into</w:t>
+                        <w:t xml:space="preserve"/>
+                      </w:r>
+                      <w:r>
+                        <w:rPr>
+                          <w:color w:val="000000"/>
+                        </w:rPr>
+                        <w:t/>
                       </w:r>
                       <w:r>
                         <w:rPr>
                           <w:color w:val="000000"/>
                           <w:spacing w:val="-3"/>
                         </w:rPr>
-                        <w:t xml:space="preserve"> </w:t>
-                      </w:r>
-                      <w:r>
-                        <w:rPr>
-                          <w:color w:val="000000"/>
-                        </w:rPr>
-                        <w:t>one</w:t>
+                        <w:t xml:space="preserve"/>
+                      </w:r>
+                      <w:r>
+                        <w:rPr>
+                          <w:color w:val="000000"/>
+                        </w:rPr>
+                        <w:t/>
                       </w:r>
                       <w:r>
                         <w:rPr>
                           <w:color w:val="000000"/>
                           <w:spacing w:val="-4"/>
                         </w:rPr>
-                        <w:t xml:space="preserve"> </w:t>
-                      </w:r>
-                      <w:r>
-                        <w:rPr>
-                          <w:color w:val="000000"/>
-                        </w:rPr>
-                        <w:t>path,</w:t>
+                        <w:t xml:space="preserve"/>
+                      </w:r>
+                      <w:r>
+                        <w:rPr>
+                          <w:color w:val="000000"/>
+                        </w:rPr>
+                        <w:t/>
                       </w:r>
                       <w:r>
                         <w:rPr>
                           <w:color w:val="000000"/>
                           <w:spacing w:val="-3"/>
                         </w:rPr>
-                        <w:t xml:space="preserve"> </w:t>
-                      </w:r>
-                      <w:r>
-                        <w:rPr>
-                          <w:color w:val="000000"/>
-                        </w:rPr>
-                        <w:t>it</w:t>
+                        <w:t xml:space="preserve"/>
+                      </w:r>
+                      <w:r>
+                        <w:rPr>
+                          <w:color w:val="000000"/>
+                        </w:rPr>
+                        <w:t/>
                       </w:r>
                       <w:r>
                         <w:rPr>
                           <w:color w:val="000000"/>
                           <w:spacing w:val="-4"/>
                         </w:rPr>
-                        <w:t xml:space="preserve"> </w:t>
-                      </w:r>
-                      <w:r>
-                        <w:rPr>
-                          <w:color w:val="000000"/>
-                        </w:rPr>
-                        <w:t>gives</w:t>
+                        <w:t xml:space="preserve"/>
+                      </w:r>
+                      <w:r>
+                        <w:rPr>
+                          <w:color w:val="000000"/>
+                        </w:rPr>
+                        <w:t/>
                       </w:r>
                       <w:r>
                         <w:rPr>
                           <w:color w:val="000000"/>
                           <w:spacing w:val="-2"/>
                         </w:rPr>
-                        <w:t xml:space="preserve"> </w:t>
-                      </w:r>
-                      <w:r>
-                        <w:rPr>
-                          <w:color w:val="000000"/>
-                        </w:rPr>
-                        <w:t>you</w:t>
+                        <w:t xml:space="preserve"/>
+                      </w:r>
+                      <w:r>
+                        <w:rPr>
+                          <w:color w:val="000000"/>
+                        </w:rPr>
+                        <w:t/>
                       </w:r>
                       <w:r>
                         <w:rPr>
                           <w:color w:val="000000"/>
                           <w:spacing w:val="-4"/>
                         </w:rPr>
-                        <w:t xml:space="preserve"> </w:t>
-                      </w:r>
-                      <w:r>
-                        <w:rPr>
-                          <w:color w:val="000000"/>
-                        </w:rPr>
-                        <w:t>skills</w:t>
+                        <w:t xml:space="preserve"/>
+                      </w:r>
+                      <w:r>
+                        <w:rPr>
+                          <w:color w:val="000000"/>
+                        </w:rPr>
+                        <w:t/>
                       </w:r>
                       <w:r>
                         <w:rPr>
                           <w:color w:val="000000"/>
                           <w:spacing w:val="-4"/>
                         </w:rPr>
-                        <w:t xml:space="preserve"> </w:t>
-                      </w:r>
-                      <w:r>
-                        <w:rPr>
-                          <w:color w:val="000000"/>
-                        </w:rPr>
-                        <w:t>you</w:t>
+                        <w:t xml:space="preserve"/>
+                      </w:r>
+                      <w:r>
+                        <w:rPr>
+                          <w:color w:val="000000"/>
+                        </w:rPr>
+                        <w:t/>
                       </w:r>
                       <w:r>
                         <w:rPr>
                           <w:color w:val="000000"/>
                           <w:spacing w:val="-4"/>
                         </w:rPr>
-                        <w:t xml:space="preserve"> </w:t>
-                      </w:r>
-                      <w:r>
-                        <w:rPr>
-                          <w:color w:val="000000"/>
-                        </w:rPr>
-                        <w:t>can</w:t>
+                        <w:t xml:space="preserve"/>
+                      </w:r>
+                      <w:r>
+                        <w:rPr>
+                          <w:color w:val="000000"/>
+                        </w:rPr>
+                        <w:t/>
                       </w:r>
                       <w:r>
                         <w:rPr>
                           <w:color w:val="000000"/>
                           <w:spacing w:val="-4"/>
                         </w:rPr>
-                        <w:t xml:space="preserve"> </w:t>
-                      </w:r>
-                      <w:r>
-                        <w:rPr>
-                          <w:color w:val="000000"/>
-                        </w:rPr>
-                        <w:t>use</w:t>
+                        <w:t xml:space="preserve"/>
+                      </w:r>
+                      <w:r>
+                        <w:rPr>
+                          <w:color w:val="000000"/>
+                        </w:rPr>
+                        <w:t/>
                       </w:r>
                       <w:r>
                         <w:rPr>
                           <w:color w:val="000000"/>
                           <w:spacing w:val="-4"/>
                         </w:rPr>
-                        <w:t xml:space="preserve"> </w:t>
-                      </w:r>
-                      <w:r>
-                        <w:rPr>
-                          <w:color w:val="000000"/>
-                        </w:rPr>
-                        <w:t>almost</w:t>
+                        <w:t xml:space="preserve"/>
+                      </w:r>
+                      <w:r>
+                        <w:rPr>
+                          <w:color w:val="000000"/>
+                        </w:rPr>
+                        <w:t/>
                       </w:r>
                       <w:r>
                         <w:rPr>
                           <w:color w:val="000000"/>
                           <w:spacing w:val="-3"/>
                         </w:rPr>
-                        <w:t xml:space="preserve"> </w:t>
-                      </w:r>
-                      <w:r>
-                        <w:rPr>
-                          <w:color w:val="000000"/>
-                        </w:rPr>
-                        <w:t xml:space="preserve">anywhere. Here are some common directions landscape architecture students go:</w:t>
+                        <w:t xml:space="preserve"/>
+                      </w:r>
+                      <w:r>
+                        <w:rPr>
+                          <w:color w:val="000000"/>
+                        </w:rPr>
+                        <w:t xml:space="preserve"/>
                       </w:r>
                     </w:p>
                     <w:p>
@@ -7499,7 +7499,7 @@
                           <w:color w:val="000000"/>
                           <w:sz w:val="18"/>
                         </w:rPr>
-                        <w:t>💼</w:t>
+                        <w:t xml:space="preserve">🏗️ Design Practice</w:t>
                       </w:r>
                       <w:r>
                         <w:rPr>
@@ -7509,7 +7509,7 @@
                           <w:spacing w:val="-11"/>
                           <w:sz w:val="18"/>
                         </w:rPr>
-                        <w:t xml:space="preserve"> </w:t>
+                        <w:t xml:space="preserve"/>
                       </w:r>
                       <w:r>
                         <w:rPr>
@@ -7517,7 +7517,7 @@
                           <w:color w:val="000000"/>
                           <w:sz w:val="18"/>
                         </w:rPr>
-                        <w:t xml:space="preserve">Design Practice</w:t>
+                        <w:t xml:space="preserve"/>
                       </w:r>
                       <w:r>
                         <w:rPr>
@@ -7679,7 +7679,7 @@
                         <w:rPr>
                           <w:color w:val="000000"/>
                         </w:rPr>
-                        <w:t xml:space="preserve">Project Manager</w:t>
+                        <w:t xml:space="preserve">Designing parks, campuses, streetscapes, and public spaces</w:t>
                       </w:r>
                       <w:r>
                         <w:rPr>
@@ -7758,7 +7758,7 @@
                           <w:color w:val="000000"/>
                           <w:sz w:val="18"/>
                         </w:rPr>
-                        <w:t>👥</w:t>
+                        <w:t xml:space="preserve">🌿 Environmental Planning &amp; Restoration</w:t>
                       </w:r>
                       <w:r>
                         <w:rPr>
@@ -7768,7 +7768,7 @@
                           <w:spacing w:val="-12"/>
                           <w:sz w:val="18"/>
                         </w:rPr>
-                        <w:t xml:space="preserve"> </w:t>
+                        <w:t xml:space="preserve"/>
                       </w:r>
                       <w:r>
                         <w:rPr>
@@ -7776,7 +7776,7 @@
                           <w:color w:val="000000"/>
                           <w:sz w:val="18"/>
                         </w:rPr>
-                        <w:t>Human</w:t>
+                        <w:t/>
                       </w:r>
                       <w:r>
                         <w:rPr>
@@ -7785,7 +7785,7 @@
                           <w:spacing w:val="-3"/>
                           <w:sz w:val="18"/>
                         </w:rPr>
-                        <w:t xml:space="preserve"> </w:t>
+                        <w:t xml:space="preserve"/>
                       </w:r>
                       <w:r>
                         <w:rPr>
@@ -7793,7 +7793,7 @@
                           <w:color w:val="000000"/>
                           <w:sz w:val="18"/>
                         </w:rPr>
-                        <w:t>Resources</w:t>
+                        <w:t/>
                       </w:r>
                       <w:r>
                         <w:rPr>
@@ -7802,7 +7802,7 @@
                           <w:spacing w:val="-1"/>
                           <w:sz w:val="18"/>
                         </w:rPr>
-                        <w:t xml:space="preserve"> </w:t>
+                        <w:t xml:space="preserve"/>
                       </w:r>
                       <w:r>
                         <w:rPr>
@@ -7811,7 +7811,7 @@
                           <w:spacing w:val="-4"/>
                           <w:sz w:val="18"/>
                         </w:rPr>
-                        <w:t>(HR)</w:t>
+                        <w:t/>
                       </w:r>
                     </w:p>
                     <w:p>
@@ -7834,7 +7834,7 @@
                         <w:rPr>
                           <w:color w:val="000000"/>
                         </w:rPr>
-                        <w:t xml:space="preserve">Parks &amp; Recreation Planner</w:t>
+                        <w:t xml:space="preserve">Green Infrastructure Specialist</w:t>
                       </w:r>
                       <w:r>
                         <w:rPr>
@@ -7897,7 +7897,7 @@
                         <w:rPr>
                           <w:color w:val="000000"/>
                         </w:rPr>
-                        <w:t xml:space="preserve">Green Infrastructure Specialist</w:t>
+                        <w:t xml:space="preserve">Environmental Restoration Designer</w:t>
                       </w:r>
                       <w:r>
                         <w:rPr>
@@ -7947,7 +7947,7 @@
                         <w:rPr>
                           <w:color w:val="000000"/>
                         </w:rPr>
-                        <w:t xml:space="preserve">Environmental Restoration Designer</w:t>
+                        <w:t xml:space="preserve">Stormwater Management Designer</w:t>
                       </w:r>
                       <w:r>
                         <w:rPr>
@@ -8003,7 +8003,7 @@
                           <w:color w:val="000000"/>
                           <w:sz w:val="18"/>
                         </w:rPr>
-                        <w:t>📊</w:t>
+                        <w:t xml:space="preserve">🏛️ Government &amp; Public Sector</w:t>
                       </w:r>
                       <w:r>
                         <w:rPr>
@@ -8013,7 +8013,7 @@
                           <w:spacing w:val="-13"/>
                           <w:sz w:val="18"/>
                         </w:rPr>
-                        <w:t xml:space="preserve"> </w:t>
+                        <w:t xml:space="preserve"/>
                       </w:r>
                       <w:r>
                         <w:rPr>
@@ -8021,7 +8021,7 @@
                           <w:color w:val="000000"/>
                           <w:sz w:val="18"/>
                         </w:rPr>
-                        <w:t xml:space="preserve">Environmental Planning &amp; Design</w:t>
+                        <w:t xml:space="preserve"/>
                       </w:r>
                       <w:r>
                         <w:rPr>
@@ -8096,7 +8096,7 @@
                         <w:rPr>
                           <w:color w:val="000000"/>
                         </w:rPr>
-                        <w:t xml:space="preserve">Land Development Consultant</w:t>
+                        <w:t xml:space="preserve">Parks &amp; Recreation Planner</w:t>
                       </w:r>
                       <w:r>
                         <w:rPr>
@@ -8191,7 +8191,7 @@
                         <w:rPr>
                           <w:color w:val="000000"/>
                         </w:rPr>
-                        <w:t xml:space="preserve">Stormwater Management Designer</w:t>
+                        <w:t xml:space="preserve">Campus &amp; Institutional Planner</w:t>
                       </w:r>
                       <w:r>
                         <w:rPr>
@@ -8280,7 +8280,7 @@
                         <w:rPr>
                           <w:color w:val="000000"/>
                         </w:rPr>
-                        <w:t xml:space="preserve">Campus &amp; Institutional Planner</w:t>
+                        <w:t xml:space="preserve">Working with NPS, NRCS/USDA, State DOTs, and municipal agencies</w:t>
                       </w:r>
                       <w:r>
                         <w:rPr>
@@ -8395,7 +8395,7 @@
                         <w:rPr>
                           <w:color w:val="000000"/>
                         </w:rPr>
-                        <w:t xml:space="preserve"/>
+                        <w:t xml:space="preserve">Shaping policy on green infrastructure and public space</w:t>
                       </w:r>
                       <w:r>
                         <w:rPr>
@@ -8502,7 +8502,7 @@
                           <w:color w:val="000000"/>
                           <w:sz w:val="18"/>
                         </w:rPr>
-                        <w:t>💡</w:t>
+                        <w:t xml:space="preserve">💼 Consulting &amp; Private Development</w:t>
                       </w:r>
                       <w:r>
                         <w:rPr>
@@ -8512,7 +8512,7 @@
                           <w:spacing w:val="-10"/>
                           <w:sz w:val="18"/>
                         </w:rPr>
-                        <w:t xml:space="preserve"> </w:t>
+                        <w:t xml:space="preserve"/>
                       </w:r>
                       <w:r>
                         <w:rPr>
@@ -8521,7 +8521,7 @@
                           <w:spacing w:val="-2"/>
                           <w:sz w:val="18"/>
                         </w:rPr>
-                        <w:t xml:space="preserve">Ecological Design</w:t>
+                        <w:t xml:space="preserve"/>
                       </w:r>
                     </w:p>
                     <w:p>
@@ -8544,7 +8544,7 @@
                         <w:rPr>
                           <w:color w:val="000000"/>
                         </w:rPr>
-                        <w:t xml:space="preserve"/>
+                        <w:t xml:space="preserve">Project Manager</w:t>
                       </w:r>
                       <w:r>
                         <w:rPr>
@@ -8600,7 +8600,7 @@
                         <w:rPr>
                           <w:color w:val="000000"/>
                         </w:rPr>
-                        <w:t xml:space="preserve"/>
+                        <w:t xml:space="preserve">Land Development Consultant</w:t>
                       </w:r>
                       <w:r>
                         <w:rPr>
@@ -8689,7 +8689,7 @@
                         <w:rPr>
                           <w:color w:val="000000"/>
                         </w:rPr>
-                        <w:t xml:space="preserve"/>
+                        <w:t xml:space="preserve">Working with firms like AECOM, SWA, Sasaki, HOK, Design Workshop</w:t>
                       </w:r>
                       <w:r>
                         <w:rPr>
@@ -8761,7 +8761,7 @@
                           <w:rFonts w:ascii="Segoe UI Emoji" w:eastAsia="Segoe UI Emoji"/>
                           <w:color w:val="000000"/>
                         </w:rPr>
-                        <w:t>🌎</w:t>
+                        <w:t xml:space="preserve">📝 Licensure &amp; Advanced Practice</w:t>
                       </w:r>
                       <w:r>
                         <w:rPr>
@@ -8769,13 +8769,13 @@
                           <w:color w:val="000000"/>
                           <w:spacing w:val="-12"/>
                         </w:rPr>
-                        <w:t xml:space="preserve"> </w:t>
-                      </w:r>
-                      <w:r>
-                        <w:rPr>
-                          <w:color w:val="000000"/>
-                        </w:rPr>
-                        <w:t xml:space="preserve">Public Sector &amp; Community Design</w:t>
+                        <w:t xml:space="preserve"/>
+                      </w:r>
+                      <w:r>
+                        <w:rPr>
+                          <w:color w:val="000000"/>
+                        </w:rPr>
+                        <w:t xml:space="preserve"/>
                       </w:r>
                       <w:r>
                         <w:rPr>
@@ -8831,7 +8831,7 @@
                         <w:rPr>
                           <w:color w:val="000000"/>
                         </w:rPr>
-                        <w:t xml:space="preserve"/>
+                        <w:t xml:space="preserve">Pursue LARE licensure after 4 years of professional experience</w:t>
                       </w:r>
                       <w:r>
                         <w:rPr>
@@ -8946,7 +8946,7 @@
                         <w:rPr>
                           <w:color w:val="000000"/>
                         </w:rPr>
-                        <w:t xml:space="preserve"/>
+                        <w:t xml:space="preserve">Advance to principal, partner, or department head roles</w:t>
                       </w:r>
                       <w:r>
                         <w:rPr>
@@ -14130,7 +14130,7 @@
                 <w:spacing w:val="-2"/>
                 <w:sz w:val="14"/>
               </w:rPr>
-              <w:t xml:space="preserve">Complete a career interest or strengths assessment through Career Services</w:t>
+              <w:t xml:space="preserve">Complete a career interest or strengths assessment</w:t>
             </w:r>
             <w:r>
               <w:rPr>
@@ -14181,7 +14181,7 @@
               <w:rPr>
                 <w:sz w:val="14"/>
               </w:rPr>
-              <w:t xml:space="preserve">Attend 'What is Landscape Architecture?' departmental info session</w:t>
+              <w:t xml:space="preserve">Attend 'What is Landscape Architecture?' departmental</w:t>
             </w:r>
             <w:r>
               <w:rPr>
@@ -14373,7 +14373,7 @@
               <w:rPr>
                 <w:sz w:val="14"/>
               </w:rPr>
-              <w:t xml:space="preserve">Attend guest lectures from practicing landscape architects</w:t>
+              <w:t xml:space="preserve">Attend guest lectures from practicing landscape</w:t>
             </w:r>
             <w:r>
               <w:rPr>
@@ -14468,7 +14468,7 @@
               <w:rPr>
                 <w:sz w:val="14"/>
               </w:rPr>
-              <w:t xml:space="preserve">Explore different LA career paths (urban design, parks, ecological restoration)</w:t>
+              <w:t xml:space="preserve">Explore different LA career paths (urban design,</w:t>
             </w:r>
             <w:r>
               <w:rPr>
@@ -14960,7 +14960,7 @@
               <w:rPr>
                 <w:sz w:val="14"/>
               </w:rPr>
-              <w:t xml:space="preserve">Declare focus area within LA (design, planning, ecology)</w:t>
+              <w:t xml:space="preserve">Declare focus area within LA (design, planning,</w:t>
             </w:r>
             <w:r>
               <w:rPr>
@@ -15035,7 +15035,7 @@
               <w:rPr>
                 <w:sz w:val="14"/>
               </w:rPr>
-              <w:t xml:space="preserve">Refine career interests through studio coursework and critiques</w:t>
+              <w:t xml:space="preserve">Refine career interests through studio coursework and</w:t>
             </w:r>
             <w:r>
               <w:rPr>
@@ -15291,7 +15291,7 @@
               <w:rPr>
                 <w:sz w:val="14"/>
               </w:rPr>
-              <w:t xml:space="preserve">Explore minor or certificate options (GIS, sustainability, planning)</w:t>
+              <w:t xml:space="preserve">Explore minor or certificate options (GIS,</w:t>
             </w:r>
             <w:r>
               <w:rPr>
@@ -15353,7 +15353,7 @@
               <w:rPr>
                 <w:sz w:val="14"/>
               </w:rPr>
-              <w:t xml:space="preserve">Identify preferred work environments (firm, agency, nonprofit)</w:t>
+              <w:t xml:space="preserve">Identify preferred work environments (firm, agency,</w:t>
             </w:r>
             <w:r>
               <w:rPr>
@@ -15786,7 +15786,7 @@
               <w:rPr>
                 <w:sz w:val="14"/>
               </w:rPr>
-              <w:t xml:space="preserve">Set post-graduation goals (grad school, employment, licensure)</w:t>
+              <w:t xml:space="preserve">Set post-graduation goals (grad school, employment,</w:t>
             </w:r>
             <w:proofErr w:type="gramEnd"/>
             <w:r>
@@ -16390,7 +16390,7 @@
               <w:rPr>
                 <w:sz w:val="14"/>
               </w:rPr>
-              <w:t xml:space="preserve">Align job search with personal values and design philosophy</w:t>
+              <w:t xml:space="preserve">Align job search with personal values and design</w:t>
             </w:r>
             <w:r>
               <w:rPr>
@@ -17105,7 +17105,7 @@
               <w:rPr>
                 <w:sz w:val="14"/>
               </w:rPr>
-              <w:t xml:space="preserve">Connect with an upperclassmen peer mentor in the LA program</w:t>
+              <w:t xml:space="preserve">Connect with an upperclassmen peer mentor in the LA</w:t>
             </w:r>
             <w:proofErr w:type="gramEnd"/>
             <w:r>
@@ -17231,7 +17231,7 @@
               <w:rPr>
                 <w:sz w:val="14"/>
               </w:rPr>
-              <w:t xml:space="preserve">Attend campus involvement fairs and explore interdisciplinary orgs</w:t>
+              <w:t xml:space="preserve">Attend campus involvement fairs and explore</w:t>
             </w:r>
             <w:r>
               <w:rPr>
@@ -17782,7 +17782,7 @@
               <w:rPr>
                 <w:sz w:val="14"/>
               </w:rPr>
-              <w:t xml:space="preserve">Volunteer through student organizations in the Greensboro community</w:t>
+              <w:t xml:space="preserve">Volunteer through student organizations in the</w:t>
             </w:r>
             <w:r>
               <w:rPr>
@@ -18461,7 +18461,7 @@
                 <w:spacing w:val="-2"/>
                 <w:sz w:val="14"/>
               </w:rPr>
-              <w:t xml:space="preserve">Build professional network through firm visits and alumni</w:t>
+              <w:t xml:space="preserve">Build professional network through firm visits and</w:t>
             </w:r>
             <w:r>
               <w:rPr>
@@ -19912,7 +19912,7 @@
               <w:rPr>
                 <w:sz w:val="14"/>
               </w:rPr>
-              <w:t xml:space="preserve">Participate in campus landscape walking tours and site sketching</w:t>
+              <w:t xml:space="preserve">Participate in campus landscape walking tours and site</w:t>
             </w:r>
             <w:proofErr w:type="gramEnd"/>
             <w:r>
@@ -19990,7 +19990,7 @@
               <w:rPr>
                 <w:sz w:val="14"/>
               </w:rPr>
-              <w:t xml:space="preserve">Volunteer at a local park cleanup or tree planting event</w:t>
+              <w:t xml:space="preserve">Volunteer at a local park cleanup or tree planting</w:t>
             </w:r>
             <w:proofErr w:type="gramEnd"/>
             <w:r>
@@ -20067,7 +20067,7 @@
               <w:rPr>
                 <w:sz w:val="14"/>
               </w:rPr>
-              <w:t xml:space="preserve">Explore Greensboro's built environment through observation walks</w:t>
+              <w:t xml:space="preserve">Explore Greensboro's built environment through</w:t>
             </w:r>
             <w:r>
               <w:rPr>
@@ -20702,7 +20702,7 @@
               <w:rPr>
                 <w:sz w:val="14"/>
               </w:rPr>
-              <w:t xml:space="preserve">Attend civic engagement events related to urban development</w:t>
+              <w:t xml:space="preserve">Attend civic engagement events related to urban</w:t>
             </w:r>
             <w:r>
               <w:rPr>
@@ -20778,7 +20778,7 @@
               <w:rPr>
                 <w:sz w:val="14"/>
               </w:rPr>
-              <w:t xml:space="preserve">Visit local landscape architecture firms or project sites</w:t>
+              <w:t xml:space="preserve">Visit local landscape architecture firms or project</w:t>
             </w:r>
             <w:r>
               <w:rPr>
@@ -22260,7 +22260,7 @@
               <w:rPr>
                 <w:sz w:val="14"/>
               </w:rPr>
-              <w:t xml:space="preserve">Present portfolio to external reviewers and professionals</w:t>
+              <w:t xml:space="preserve">Present portfolio to external reviewers and</w:t>
             </w:r>
             <w:proofErr w:type="gramEnd"/>
             <w:r>
@@ -23194,7 +23194,7 @@
               <w:rPr>
                 <w:sz w:val="14"/>
               </w:rPr>
-              <w:t xml:space="preserve">Complete a professional dress or business etiquette workshop</w:t>
+              <w:t xml:space="preserve">Complete a professional dress or business etiquette</w:t>
             </w:r>
             <w:r>
               <w:rPr>
@@ -23271,7 +23271,7 @@
               <w:rPr>
                 <w:sz w:val="14"/>
               </w:rPr>
-              <w:t xml:space="preserve">Participate in first-year professional development seminars</w:t>
+              <w:t xml:space="preserve">Participate in first-year professional development</w:t>
             </w:r>
             <w:proofErr w:type="gramEnd"/>
             <w:r>
@@ -24481,7 +24481,7 @@
               <w:rPr>
                 <w:sz w:val="14"/>
               </w:rPr>
-              <w:t xml:space="preserve">Align skills with career interests through self-assessment</w:t>
+              <w:t xml:space="preserve">Align skills with career interests through</w:t>
             </w:r>
             <w:r>
               <w:rPr>

</xml_diff>